<commit_message>
Veertiendagenbrief: neutrale slotzin over uit handen geven en rechtsmaatregelen
Co-Authored-By: Claude Fable 5 <noreply@anthropic.com>
</commit_message>
<xml_diff>
--- a/public/downloads/modelbrief-veertiendagenbrief.docx
+++ b/public/downloads/modelbrief-veertiendagenbrief.docx
@@ -107,6 +107,16 @@
           <w:sz w:val="22"/>
           <w:rFonts w:ascii="Calibri" w:hAnsi="Calibri"/>
         </w:rPr>
+        <w:t xml:space="preserve">Blijft betaling ook binnen deze termijn uit, dan kunnen wij de vordering ter incasso uit handen geven of rechtsmaatregelen treffen; de wet bepaalt welke kosten daarvan op u kunnen worden verhaald.</w:t>
+      </w:r>
+    </w:p>
+    <w:p/>
+    <w:p>
+      <w:r>
+        <w:rPr>
+          <w:sz w:val="22"/>
+          <w:rFonts w:ascii="Calibri" w:hAnsi="Calibri"/>
+        </w:rPr>
         <w:t xml:space="preserve">Heeft u het bedrag inmiddels betaald, dan kunt u deze brief als niet verzonden beschouwen. Voor vragen of het treffen van een betalingsregeling kunt u contact opnemen via [telefoonnummer/e-mailadres].</w:t>
       </w:r>
     </w:p>

</xml_diff>